<commit_message>
fix: swap Google Scholar links and remove email placeholder in proposal
</commit_message>
<xml_diff>
--- a/BookChapter_Proposal_Eilu_Final.docx
+++ b/BookChapter_Proposal_Eilu_Final.docx
@@ -664,7 +664,7 @@
           <w:sz w:val="22"/>
           <w:szCs w:val="22"/>
         </w:rPr>
-        <w:t xml:space="preserve">https://scholar.google.com/citations?user=69JBvM8AAAAJ&amp;hl=en</w:t>
+        <w:t>https://scholar.google.com/citations?view_op=list_works&amp;hl=en&amp;user=Gv3YG8UAAAAJ</w:t>
       </w:r>
     </w:p>
     <w:p>
@@ -824,7 +824,7 @@
           <w:sz w:val="22"/>
           <w:szCs w:val="22"/>
         </w:rPr>
-        <w:t xml:space="preserve">[mfrikha@kfu.edu.sa — please confirm]</w:t>
+        <w:t>mfrikha@kfu.edu.sa</w:t>
       </w:r>
     </w:p>
     <w:p>
@@ -848,7 +848,7 @@
           <w:sz w:val="22"/>
           <w:szCs w:val="22"/>
         </w:rPr>
-        <w:t xml:space="preserve">https://scholar.google.com/citations?view_op=list_works&amp;hl=en&amp;user=Gv3YG8UAAAAJ</w:t>
+        <w:t>https://scholar.google.com/citations?user=69JBvM8AAAAJ&amp;hl=en</w:t>
       </w:r>
     </w:p>
     <w:p>

</xml_diff>